<commit_message>
Refactor codebase: unify CLI, add Combo Loss, AMP, TTA, evaluation metrics, and updated project reports
</commit_message>
<xml_diff>
--- a/reports/Отчет_Изменения.docx
+++ b/reports/Отчет_Изменения.docx
@@ -4,199 +4,1078 @@
   <w:body>
     <w:p>
       <w:pPr>
-        <w:pStyle w:val="Title"/>
-        <w:jc w:val="center"/>
+        <w:spacing w:before="0" w:after="80"/>
       </w:pPr>
       <w:r>
-        <w:t>Отчет об изменениях: Обучение моделей сегментации</w:t>
+        <w:rPr>
+          <w:rFonts w:ascii="Calibri" w:hAnsi="Calibri"/>
+          <w:b/>
+          <w:color w:val="000000"/>
+          <w:sz w:val="40"/>
+        </w:rPr>
+        <w:t>Отчет об изменениях в кодовой базе</w:t>
       </w:r>
     </w:p>
     <w:p>
+      <w:pPr>
+        <w:spacing w:before="0" w:after="280"/>
+      </w:pPr>
       <w:r>
-        <w:t>В ходе последних сессий была проделана огромная работа по обучению двух моделей для бинарной сегментации на основе архитектуры EfficientNet-B7 + UNet. Ниже представлен подробный пошаговый отчет о выполненных задачах для обоих датасетов.</w:t>
+        <w:rPr>
+          <w:rFonts w:ascii="Calibri" w:hAnsi="Calibri"/>
+          <w:b/>
+          <w:color w:val="000000"/>
+          <w:sz w:val="28"/>
+        </w:rPr>
+        <w:t>Сегментация дорог и зданий на аэрофотоснимках (Roads &amp; Buildings Segmentation)</w:t>
       </w:r>
     </w:p>
     <w:p>
       <w:pPr>
         <w:pStyle w:val="Heading1"/>
+        <w:spacing w:before="200" w:after="80"/>
       </w:pPr>
       <w:r>
-        <w:t>Часть 1: Сегментация зданий (Massachusetts Buildings Dataset)</w:t>
+        <w:rPr>
+          <w:color w:val="000000"/>
+        </w:rPr>
+        <w:t>1. Задачи доработки проекта</w:t>
       </w:r>
     </w:p>
     <w:p>
+      <w:pPr>
+        <w:spacing w:after="40"/>
+      </w:pPr>
       <w:r>
-        <w:t>В первой части мы настраивали пайплайн и обучали модель на датасете со зданиями (около 1.5 ГБ).</w:t>
+        <w:t>Перечень выполненных технических задач:</w:t>
+      </w:r>
+    </w:p>
+    <w:p>
+      <w:pPr>
+        <w:pStyle w:val="ListBullet"/>
+        <w:spacing w:after="40"/>
+      </w:pPr>
+      <w:r>
+        <w:rPr>
+          <w:b/>
+          <w:color w:val="000000"/>
+        </w:rPr>
+        <w:t xml:space="preserve">Оптимизация сегментации дорог: </w:t>
+      </w:r>
+      <w:r>
+        <w:rPr>
+          <w:color w:val="000000"/>
+        </w:rPr>
+        <w:t>устранение разрывов дорожной сети за счет замены функции потерь на Combo Loss.</w:t>
+      </w:r>
+    </w:p>
+    <w:p>
+      <w:pPr>
+        <w:pStyle w:val="ListBullet"/>
+        <w:spacing w:after="40"/>
+      </w:pPr>
+      <w:r>
+        <w:rPr>
+          <w:b/>
+          <w:color w:val="000000"/>
+        </w:rPr>
+        <w:t xml:space="preserve">Устранение дублирования кода: </w:t>
+      </w:r>
+      <w:r>
+        <w:rPr>
+          <w:color w:val="000000"/>
+        </w:rPr>
+        <w:t>объединение пяти независимых скриптов в модульную систему с общим CLI.</w:t>
+      </w:r>
+    </w:p>
+    <w:p>
+      <w:pPr>
+        <w:pStyle w:val="ListBullet"/>
+        <w:spacing w:after="40"/>
+      </w:pPr>
+      <w:r>
+        <w:rPr>
+          <w:b/>
+          <w:color w:val="000000"/>
+        </w:rPr>
+        <w:t xml:space="preserve">Смешанная точность (AMP): </w:t>
+      </w:r>
+      <w:r>
+        <w:rPr>
+          <w:color w:val="000000"/>
+        </w:rPr>
+        <w:t>поддержка FP16 через PyTorch AMP для снижения расхода видеопамяти на GPU.</w:t>
+      </w:r>
+    </w:p>
+    <w:p>
+      <w:pPr>
+        <w:pStyle w:val="ListBullet"/>
+        <w:spacing w:after="40"/>
+      </w:pPr>
+      <w:r>
+        <w:rPr>
+          <w:b/>
+          <w:color w:val="000000"/>
+        </w:rPr>
+        <w:t xml:space="preserve">Формат чекпоинтов: </w:t>
+      </w:r>
+      <w:r>
+        <w:rPr>
+          <w:color w:val="000000"/>
+        </w:rPr>
+        <w:t>переход с сериализации объектов модели (pickle) на словари весов (state_dict) с метаданными.</w:t>
+      </w:r>
+    </w:p>
+    <w:p>
+      <w:pPr>
+        <w:pStyle w:val="ListBullet"/>
+        <w:spacing w:after="40"/>
+      </w:pPr>
+      <w:r>
+        <w:rPr>
+          <w:b/>
+          <w:color w:val="000000"/>
+        </w:rPr>
+        <w:t xml:space="preserve">Контроль сходимости: </w:t>
+      </w:r>
+      <w:r>
+        <w:rPr>
+          <w:color w:val="000000"/>
+        </w:rPr>
+        <w:t>добавление Early Stopping и логирования метрик в TensorBoard.</w:t>
+      </w:r>
+    </w:p>
+    <w:p>
+      <w:pPr>
+        <w:pStyle w:val="ListBullet"/>
+        <w:spacing w:after="40"/>
+      </w:pPr>
+      <w:r>
+        <w:rPr>
+          <w:b/>
+          <w:color w:val="000000"/>
+        </w:rPr>
+        <w:t xml:space="preserve">Совместимость с Windows: </w:t>
+      </w:r>
+      <w:r>
+        <w:rPr>
+          <w:color w:val="000000"/>
+        </w:rPr>
+        <w:t>исправление ошибок кодировки cp1251 и отключение предупреждений OpenCV о TIFF-файлах.</w:t>
+      </w:r>
+    </w:p>
+    <w:p>
+      <w:pPr>
+        <w:spacing w:before="160" w:after="200"/>
+        <w:pBdr>
+          <w:bottom w:val="single" w:sz="4" w:space="1" w:color="CCCCCC"/>
+        </w:pBdr>
+      </w:pPr>
+    </w:p>
+    <w:p>
+      <w:pPr>
+        <w:pStyle w:val="Heading1"/>
+        <w:spacing w:before="200" w:after="80"/>
+      </w:pPr>
+      <w:r>
+        <w:rPr>
+          <w:color w:val="000000"/>
+        </w:rPr>
+        <w:t>2. Изменения в кодовой базе (Было / Стало)</w:t>
       </w:r>
     </w:p>
     <w:p>
       <w:pPr>
         <w:pStyle w:val="Heading2"/>
+        <w:spacing w:before="120" w:after="60"/>
       </w:pPr>
       <w:r>
-        <w:t>Выполненные шаги:</w:t>
+        <w:rPr>
+          <w:color w:val="000000"/>
+        </w:rPr>
+        <w:t>2.1. Структура скриптов</w:t>
       </w:r>
     </w:p>
     <w:p>
       <w:pPr>
-        <w:pStyle w:val="ListNumber"/>
+        <w:spacing w:after="40"/>
+      </w:pPr>
+      <w:r>
+        <w:t>Было (разрозненные скрипты с дублированием кода):</w:t>
+      </w:r>
+    </w:p>
+    <w:tbl>
+      <w:tblPr>
+        <w:tblW w:type="auto" w:w="0"/>
+        <w:jc w:val="center"/>
+        <w:tblLayout w:type="fixed"/>
+        <w:tblLook w:firstColumn="1" w:firstRow="1" w:lastColumn="0" w:lastRow="0" w:noHBand="0" w:noVBand="1" w:val="04A0"/>
+      </w:tblPr>
+      <w:tblGrid>
+        <w:gridCol w:w="9360"/>
+      </w:tblGrid>
+      <w:tr>
+        <w:tc>
+          <w:tcPr>
+            <w:tcW w:type="dxa" w:w="9360"/>
+            <w:shd w:fill="F8F8F8"/>
+            <w:tcBorders>
+              <w:top w:val="single" w:sz="4" w:space="0" w:color="CCCCCC"/>
+              <w:left w:val="single" w:sz="4" w:space="0" w:color="CCCCCC"/>
+              <w:bottom w:val="single" w:sz="4" w:space="0" w:color="CCCCCC"/>
+              <w:right w:val="single" w:sz="4" w:space="0" w:color="CCCCCC"/>
+            </w:tcBorders>
+            <w:tcMar>
+              <w:top w:w="90" w:type="dxa"/>
+              <w:bottom w:w="90" w:type="dxa"/>
+              <w:left w:w="160" w:type="dxa"/>
+              <w:right w:w="160" w:type="dxa"/>
+            </w:tcMar>
+          </w:tcPr>
+          <w:p>
+            <w:pPr>
+              <w:spacing w:before="40" w:after="40" w:line="276" w:lineRule="auto"/>
+            </w:pPr>
+            <w:r>
+              <w:rPr>
+                <w:rFonts w:ascii="Consolas" w:hAnsi="Consolas"/>
+                <w:color w:val="000000"/>
+                <w:sz w:val="19"/>
+              </w:rPr>
+              <w:t>train.py                 # Обучение только для зданий</w:t>
+            </w:r>
+            <w:r>
+              <w:br/>
+            </w:r>
+            <w:r>
+              <w:rPr>
+                <w:rFonts w:ascii="Consolas" w:hAnsi="Consolas"/>
+                <w:color w:val="000000"/>
+                <w:sz w:val="19"/>
+              </w:rPr>
+              <w:t>train_road.py            # Копия train.py для дорог</w:t>
+            </w:r>
+            <w:r>
+              <w:br/>
+            </w:r>
+            <w:r>
+              <w:rPr>
+                <w:rFonts w:ascii="Consolas" w:hAnsi="Consolas"/>
+                <w:color w:val="000000"/>
+                <w:sz w:val="19"/>
+              </w:rPr>
+              <w:t>trained_demo.py          # Инференс только для зданий</w:t>
+            </w:r>
+            <w:r>
+              <w:br/>
+            </w:r>
+            <w:r>
+              <w:rPr>
+                <w:rFonts w:ascii="Consolas" w:hAnsi="Consolas"/>
+                <w:color w:val="000000"/>
+                <w:sz w:val="19"/>
+              </w:rPr>
+              <w:t>trained_demo_road.py     # Инференс только для дорог</w:t>
+            </w:r>
+            <w:r>
+              <w:br/>
+            </w:r>
+            <w:r>
+              <w:rPr>
+                <w:rFonts w:ascii="Consolas" w:hAnsi="Consolas"/>
+                <w:color w:val="000000"/>
+                <w:sz w:val="19"/>
+              </w:rPr>
+              <w:t>generate_10_examples.py  # Скрипт генерации 10 примеров</w:t>
+            </w:r>
+          </w:p>
+        </w:tc>
+      </w:tr>
+    </w:tbl>
+    <w:p>
+      <w:pPr>
+        <w:spacing w:before="0" w:after="60"/>
+      </w:pPr>
+    </w:p>
+    <w:p>
+      <w:pPr>
+        <w:spacing w:after="40"/>
+      </w:pPr>
+      <w:r>
+        <w:t>Стало (единая модульная структура):</w:t>
+      </w:r>
+    </w:p>
+    <w:tbl>
+      <w:tblPr>
+        <w:tblW w:type="auto" w:w="0"/>
+        <w:jc w:val="center"/>
+        <w:tblLayout w:type="fixed"/>
+        <w:tblLook w:firstColumn="1" w:firstRow="1" w:lastColumn="0" w:lastRow="0" w:noHBand="0" w:noVBand="1" w:val="04A0"/>
+      </w:tblPr>
+      <w:tblGrid>
+        <w:gridCol w:w="9360"/>
+      </w:tblGrid>
+      <w:tr>
+        <w:tc>
+          <w:tcPr>
+            <w:tcW w:type="dxa" w:w="9360"/>
+            <w:shd w:fill="F8F8F8"/>
+            <w:tcBorders>
+              <w:top w:val="single" w:sz="4" w:space="0" w:color="CCCCCC"/>
+              <w:left w:val="single" w:sz="4" w:space="0" w:color="CCCCCC"/>
+              <w:bottom w:val="single" w:sz="4" w:space="0" w:color="CCCCCC"/>
+              <w:right w:val="single" w:sz="4" w:space="0" w:color="CCCCCC"/>
+            </w:tcBorders>
+            <w:tcMar>
+              <w:top w:w="90" w:type="dxa"/>
+              <w:bottom w:w="90" w:type="dxa"/>
+              <w:left w:w="160" w:type="dxa"/>
+              <w:right w:w="160" w:type="dxa"/>
+            </w:tcMar>
+          </w:tcPr>
+          <w:p>
+            <w:pPr>
+              <w:spacing w:before="40" w:after="40" w:line="276" w:lineRule="auto"/>
+            </w:pPr>
+            <w:r>
+              <w:rPr>
+                <w:rFonts w:ascii="Consolas" w:hAnsi="Consolas"/>
+                <w:color w:val="000000"/>
+                <w:sz w:val="19"/>
+              </w:rPr>
+              <w:t>config.py    # Единая конфигурация и CLI (--task road / building)</w:t>
+            </w:r>
+            <w:r>
+              <w:br/>
+            </w:r>
+            <w:r>
+              <w:rPr>
+                <w:rFonts w:ascii="Consolas" w:hAnsi="Consolas"/>
+                <w:color w:val="000000"/>
+                <w:sz w:val="19"/>
+              </w:rPr>
+              <w:t>train.py     # Единое обучение: AMP, Combo Loss, Early Stopping</w:t>
+            </w:r>
+            <w:r>
+              <w:br/>
+            </w:r>
+            <w:r>
+              <w:rPr>
+                <w:rFonts w:ascii="Consolas" w:hAnsi="Consolas"/>
+                <w:color w:val="000000"/>
+                <w:sz w:val="19"/>
+              </w:rPr>
+              <w:t>inference.py # Единый инференс: TTA, пакетная или одиночная обработка</w:t>
+            </w:r>
+            <w:r>
+              <w:br/>
+            </w:r>
+            <w:r>
+              <w:rPr>
+                <w:rFonts w:ascii="Consolas" w:hAnsi="Consolas"/>
+                <w:color w:val="000000"/>
+                <w:sz w:val="19"/>
+              </w:rPr>
+              <w:t>evaluate.py  # Расчет метрик (IoU, Dice, Precision, Recall, Acc) в JSON</w:t>
+            </w:r>
+          </w:p>
+        </w:tc>
+      </w:tr>
+    </w:tbl>
+    <w:p>
+      <w:pPr>
+        <w:spacing w:before="0" w:after="60"/>
+      </w:pPr>
+    </w:p>
+    <w:p>
+      <w:pPr>
+        <w:pStyle w:val="Heading2"/>
+        <w:spacing w:before="120" w:after="60"/>
+      </w:pPr>
+      <w:r>
+        <w:rPr>
+          <w:color w:val="000000"/>
+        </w:rPr>
+        <w:t>2.2. Функция потерь для дорог</w:t>
+      </w:r>
+    </w:p>
+    <w:p>
+      <w:pPr>
+        <w:spacing w:after="40"/>
+      </w:pPr>
+      <w:r>
+        <w:t>Было:</w:t>
+      </w:r>
+    </w:p>
+    <w:tbl>
+      <w:tblPr>
+        <w:tblW w:type="auto" w:w="0"/>
+        <w:jc w:val="center"/>
+        <w:tblLayout w:type="fixed"/>
+        <w:tblLook w:firstColumn="1" w:firstRow="1" w:lastColumn="0" w:lastRow="0" w:noHBand="0" w:noVBand="1" w:val="04A0"/>
+      </w:tblPr>
+      <w:tblGrid>
+        <w:gridCol w:w="9360"/>
+      </w:tblGrid>
+      <w:tr>
+        <w:tc>
+          <w:tcPr>
+            <w:tcW w:type="dxa" w:w="9360"/>
+            <w:shd w:fill="F8F8F8"/>
+            <w:tcBorders>
+              <w:top w:val="single" w:sz="4" w:space="0" w:color="CCCCCC"/>
+              <w:left w:val="single" w:sz="4" w:space="0" w:color="CCCCCC"/>
+              <w:bottom w:val="single" w:sz="4" w:space="0" w:color="CCCCCC"/>
+              <w:right w:val="single" w:sz="4" w:space="0" w:color="CCCCCC"/>
+            </w:tcBorders>
+            <w:tcMar>
+              <w:top w:w="90" w:type="dxa"/>
+              <w:bottom w:w="90" w:type="dxa"/>
+              <w:left w:w="160" w:type="dxa"/>
+              <w:right w:w="160" w:type="dxa"/>
+            </w:tcMar>
+          </w:tcPr>
+          <w:p>
+            <w:pPr>
+              <w:spacing w:before="40" w:after="40" w:line="276" w:lineRule="auto"/>
+            </w:pPr>
+            <w:r>
+              <w:rPr>
+                <w:rFonts w:ascii="Consolas" w:hAnsi="Consolas"/>
+                <w:color w:val="000000"/>
+                <w:sz w:val="19"/>
+              </w:rPr>
+              <w:t>criterion = smp.losses.DiceLoss(mode='binary')</w:t>
+            </w:r>
+          </w:p>
+        </w:tc>
+      </w:tr>
+    </w:tbl>
+    <w:p>
+      <w:pPr>
+        <w:spacing w:before="0" w:after="60"/>
+      </w:pPr>
+    </w:p>
+    <w:p>
+      <w:pPr>
+        <w:spacing w:after="40"/>
+      </w:pPr>
+      <w:r>
+        <w:t>Стало:</w:t>
+      </w:r>
+    </w:p>
+    <w:tbl>
+      <w:tblPr>
+        <w:tblW w:type="auto" w:w="0"/>
+        <w:jc w:val="center"/>
+        <w:tblLayout w:type="fixed"/>
+        <w:tblLook w:firstColumn="1" w:firstRow="1" w:lastColumn="0" w:lastRow="0" w:noHBand="0" w:noVBand="1" w:val="04A0"/>
+      </w:tblPr>
+      <w:tblGrid>
+        <w:gridCol w:w="9360"/>
+      </w:tblGrid>
+      <w:tr>
+        <w:tc>
+          <w:tcPr>
+            <w:tcW w:type="dxa" w:w="9360"/>
+            <w:shd w:fill="F8F8F8"/>
+            <w:tcBorders>
+              <w:top w:val="single" w:sz="4" w:space="0" w:color="CCCCCC"/>
+              <w:left w:val="single" w:sz="4" w:space="0" w:color="CCCCCC"/>
+              <w:bottom w:val="single" w:sz="4" w:space="0" w:color="CCCCCC"/>
+              <w:right w:val="single" w:sz="4" w:space="0" w:color="CCCCCC"/>
+            </w:tcBorders>
+            <w:tcMar>
+              <w:top w:w="90" w:type="dxa"/>
+              <w:bottom w:w="90" w:type="dxa"/>
+              <w:left w:w="160" w:type="dxa"/>
+              <w:right w:w="160" w:type="dxa"/>
+            </w:tcMar>
+          </w:tcPr>
+          <w:p>
+            <w:pPr>
+              <w:spacing w:before="40" w:after="40" w:line="276" w:lineRule="auto"/>
+            </w:pPr>
+            <w:r>
+              <w:rPr>
+                <w:rFonts w:ascii="Consolas" w:hAnsi="Consolas"/>
+                <w:color w:val="000000"/>
+                <w:sz w:val="19"/>
+              </w:rPr>
+              <w:t>class ComboLoss(nn.Module):</w:t>
+            </w:r>
+            <w:r>
+              <w:br/>
+            </w:r>
+            <w:r>
+              <w:rPr>
+                <w:rFonts w:ascii="Consolas" w:hAnsi="Consolas"/>
+                <w:color w:val="000000"/>
+                <w:sz w:val="19"/>
+              </w:rPr>
+              <w:t xml:space="preserve">    def __init__(self, dice_weight=1.0, bce_weight=1.0):</w:t>
+            </w:r>
+            <w:r>
+              <w:br/>
+            </w:r>
+            <w:r>
+              <w:rPr>
+                <w:rFonts w:ascii="Consolas" w:hAnsi="Consolas"/>
+                <w:color w:val="000000"/>
+                <w:sz w:val="19"/>
+              </w:rPr>
+              <w:t xml:space="preserve">        super().__init__()</w:t>
+            </w:r>
+            <w:r>
+              <w:br/>
+            </w:r>
+            <w:r>
+              <w:rPr>
+                <w:rFonts w:ascii="Consolas" w:hAnsi="Consolas"/>
+                <w:color w:val="000000"/>
+                <w:sz w:val="19"/>
+              </w:rPr>
+              <w:t xml:space="preserve">        self.dice = smp.losses.DiceLoss(mode='binary', from_logits=True)</w:t>
+            </w:r>
+            <w:r>
+              <w:br/>
+            </w:r>
+            <w:r>
+              <w:rPr>
+                <w:rFonts w:ascii="Consolas" w:hAnsi="Consolas"/>
+                <w:color w:val="000000"/>
+                <w:sz w:val="19"/>
+              </w:rPr>
+              <w:t xml:space="preserve">        self.bce = nn.BCEWithLogitsLoss()</w:t>
+            </w:r>
+            <w:r>
+              <w:br/>
+            </w:r>
+            <w:r>
+              <w:rPr>
+                <w:rFonts w:ascii="Consolas" w:hAnsi="Consolas"/>
+                <w:color w:val="000000"/>
+                <w:sz w:val="19"/>
+              </w:rPr>
+              <w:t xml:space="preserve">        self.dice_weight = dice_weight</w:t>
+            </w:r>
+            <w:r>
+              <w:br/>
+            </w:r>
+            <w:r>
+              <w:rPr>
+                <w:rFonts w:ascii="Consolas" w:hAnsi="Consolas"/>
+                <w:color w:val="000000"/>
+                <w:sz w:val="19"/>
+              </w:rPr>
+              <w:t xml:space="preserve">        self.bce_weight = bce_weight</w:t>
+            </w:r>
+            <w:r>
+              <w:br/>
+            </w:r>
+            <w:r>
+              <w:rPr>
+                <w:rFonts w:ascii="Consolas" w:hAnsi="Consolas"/>
+                <w:color w:val="000000"/>
+                <w:sz w:val="19"/>
+              </w:rPr>
+            </w:r>
+            <w:r>
+              <w:br/>
+            </w:r>
+            <w:r>
+              <w:rPr>
+                <w:rFonts w:ascii="Consolas" w:hAnsi="Consolas"/>
+                <w:color w:val="000000"/>
+                <w:sz w:val="19"/>
+              </w:rPr>
+              <w:t xml:space="preserve">    def forward(self, pred, target):</w:t>
+            </w:r>
+            <w:r>
+              <w:br/>
+            </w:r>
+            <w:r>
+              <w:rPr>
+                <w:rFonts w:ascii="Consolas" w:hAnsi="Consolas"/>
+                <w:color w:val="000000"/>
+                <w:sz w:val="19"/>
+              </w:rPr>
+              <w:t xml:space="preserve">        return self.dice_weight * self.dice(pred, target) + self.bce_weight * self.bce(pred, target)</w:t>
+            </w:r>
+          </w:p>
+        </w:tc>
+      </w:tr>
+    </w:tbl>
+    <w:p>
+      <w:pPr>
+        <w:spacing w:before="0" w:after="60"/>
+      </w:pPr>
+    </w:p>
+    <w:p>
+      <w:pPr>
+        <w:pStyle w:val="Heading2"/>
+        <w:spacing w:before="120" w:after="60"/>
+      </w:pPr>
+      <w:r>
+        <w:rPr>
+          <w:color w:val="000000"/>
+        </w:rPr>
+        <w:t>2.3. Смешанная точность (AMP)</w:t>
+      </w:r>
+    </w:p>
+    <w:p>
+      <w:pPr>
+        <w:spacing w:after="40"/>
+      </w:pPr>
+      <w:r>
+        <w:t>Было:</w:t>
+      </w:r>
+    </w:p>
+    <w:tbl>
+      <w:tblPr>
+        <w:tblW w:type="auto" w:w="0"/>
+        <w:jc w:val="center"/>
+        <w:tblLayout w:type="fixed"/>
+        <w:tblLook w:firstColumn="1" w:firstRow="1" w:lastColumn="0" w:lastRow="0" w:noHBand="0" w:noVBand="1" w:val="04A0"/>
+      </w:tblPr>
+      <w:tblGrid>
+        <w:gridCol w:w="9360"/>
+      </w:tblGrid>
+      <w:tr>
+        <w:tc>
+          <w:tcPr>
+            <w:tcW w:type="dxa" w:w="9360"/>
+            <w:shd w:fill="F8F8F8"/>
+            <w:tcBorders>
+              <w:top w:val="single" w:sz="4" w:space="0" w:color="CCCCCC"/>
+              <w:left w:val="single" w:sz="4" w:space="0" w:color="CCCCCC"/>
+              <w:bottom w:val="single" w:sz="4" w:space="0" w:color="CCCCCC"/>
+              <w:right w:val="single" w:sz="4" w:space="0" w:color="CCCCCC"/>
+            </w:tcBorders>
+            <w:tcMar>
+              <w:top w:w="90" w:type="dxa"/>
+              <w:bottom w:w="90" w:type="dxa"/>
+              <w:left w:w="160" w:type="dxa"/>
+              <w:right w:w="160" w:type="dxa"/>
+            </w:tcMar>
+          </w:tcPr>
+          <w:p>
+            <w:pPr>
+              <w:spacing w:before="40" w:after="40" w:line="276" w:lineRule="auto"/>
+            </w:pPr>
+            <w:r>
+              <w:rPr>
+                <w:rFonts w:ascii="Consolas" w:hAnsi="Consolas"/>
+                <w:color w:val="000000"/>
+                <w:sz w:val="19"/>
+              </w:rPr>
+              <w:t>outputs = model(images)</w:t>
+            </w:r>
+            <w:r>
+              <w:br/>
+            </w:r>
+            <w:r>
+              <w:rPr>
+                <w:rFonts w:ascii="Consolas" w:hAnsi="Consolas"/>
+                <w:color w:val="000000"/>
+                <w:sz w:val="19"/>
+              </w:rPr>
+              <w:t>loss = criterion(outputs, masks)</w:t>
+            </w:r>
+            <w:r>
+              <w:br/>
+            </w:r>
+            <w:r>
+              <w:rPr>
+                <w:rFonts w:ascii="Consolas" w:hAnsi="Consolas"/>
+                <w:color w:val="000000"/>
+                <w:sz w:val="19"/>
+              </w:rPr>
+              <w:t>loss.backward()</w:t>
+            </w:r>
+            <w:r>
+              <w:br/>
+            </w:r>
+            <w:r>
+              <w:rPr>
+                <w:rFonts w:ascii="Consolas" w:hAnsi="Consolas"/>
+                <w:color w:val="000000"/>
+                <w:sz w:val="19"/>
+              </w:rPr>
+              <w:t>optimizer.step()</w:t>
+            </w:r>
+          </w:p>
+        </w:tc>
+      </w:tr>
+    </w:tbl>
+    <w:p>
+      <w:pPr>
+        <w:spacing w:before="0" w:after="60"/>
+      </w:pPr>
+    </w:p>
+    <w:p>
+      <w:pPr>
+        <w:spacing w:after="40"/>
+      </w:pPr>
+      <w:r>
+        <w:t>Стало:</w:t>
+      </w:r>
+    </w:p>
+    <w:tbl>
+      <w:tblPr>
+        <w:tblW w:type="auto" w:w="0"/>
+        <w:jc w:val="center"/>
+        <w:tblLayout w:type="fixed"/>
+        <w:tblLook w:firstColumn="1" w:firstRow="1" w:lastColumn="0" w:lastRow="0" w:noHBand="0" w:noVBand="1" w:val="04A0"/>
+      </w:tblPr>
+      <w:tblGrid>
+        <w:gridCol w:w="9360"/>
+      </w:tblGrid>
+      <w:tr>
+        <w:tc>
+          <w:tcPr>
+            <w:tcW w:type="dxa" w:w="9360"/>
+            <w:shd w:fill="F8F8F8"/>
+            <w:tcBorders>
+              <w:top w:val="single" w:sz="4" w:space="0" w:color="CCCCCC"/>
+              <w:left w:val="single" w:sz="4" w:space="0" w:color="CCCCCC"/>
+              <w:bottom w:val="single" w:sz="4" w:space="0" w:color="CCCCCC"/>
+              <w:right w:val="single" w:sz="4" w:space="0" w:color="CCCCCC"/>
+            </w:tcBorders>
+            <w:tcMar>
+              <w:top w:w="90" w:type="dxa"/>
+              <w:bottom w:w="90" w:type="dxa"/>
+              <w:left w:w="160" w:type="dxa"/>
+              <w:right w:w="160" w:type="dxa"/>
+            </w:tcMar>
+          </w:tcPr>
+          <w:p>
+            <w:pPr>
+              <w:spacing w:before="40" w:after="40" w:line="276" w:lineRule="auto"/>
+            </w:pPr>
+            <w:r>
+              <w:rPr>
+                <w:rFonts w:ascii="Consolas" w:hAnsi="Consolas"/>
+                <w:color w:val="000000"/>
+                <w:sz w:val="19"/>
+              </w:rPr>
+              <w:t>scaler = torch.amp.GradScaler('cuda', enabled=use_amp)</w:t>
+            </w:r>
+            <w:r>
+              <w:br/>
+            </w:r>
+            <w:r>
+              <w:rPr>
+                <w:rFonts w:ascii="Consolas" w:hAnsi="Consolas"/>
+                <w:color w:val="000000"/>
+                <w:sz w:val="19"/>
+              </w:rPr>
+              <w:t>with torch.amp.autocast('cuda', enabled=use_amp):</w:t>
+            </w:r>
+            <w:r>
+              <w:br/>
+            </w:r>
+            <w:r>
+              <w:rPr>
+                <w:rFonts w:ascii="Consolas" w:hAnsi="Consolas"/>
+                <w:color w:val="000000"/>
+                <w:sz w:val="19"/>
+              </w:rPr>
+              <w:t xml:space="preserve">    outputs = model(images)</w:t>
+            </w:r>
+            <w:r>
+              <w:br/>
+            </w:r>
+            <w:r>
+              <w:rPr>
+                <w:rFonts w:ascii="Consolas" w:hAnsi="Consolas"/>
+                <w:color w:val="000000"/>
+                <w:sz w:val="19"/>
+              </w:rPr>
+              <w:t xml:space="preserve">    loss = criterion(outputs, masks)</w:t>
+            </w:r>
+            <w:r>
+              <w:br/>
+            </w:r>
+            <w:r>
+              <w:rPr>
+                <w:rFonts w:ascii="Consolas" w:hAnsi="Consolas"/>
+                <w:color w:val="000000"/>
+                <w:sz w:val="19"/>
+              </w:rPr>
+              <w:t>scaler.scale(loss).backward()</w:t>
+            </w:r>
+            <w:r>
+              <w:br/>
+            </w:r>
+            <w:r>
+              <w:rPr>
+                <w:rFonts w:ascii="Consolas" w:hAnsi="Consolas"/>
+                <w:color w:val="000000"/>
+                <w:sz w:val="19"/>
+              </w:rPr>
+              <w:t>scaler.step(optimizer)</w:t>
+            </w:r>
+            <w:r>
+              <w:br/>
+            </w:r>
+            <w:r>
+              <w:rPr>
+                <w:rFonts w:ascii="Consolas" w:hAnsi="Consolas"/>
+                <w:color w:val="000000"/>
+                <w:sz w:val="19"/>
+              </w:rPr>
+              <w:t>scaler.update()</w:t>
+            </w:r>
+          </w:p>
+        </w:tc>
+      </w:tr>
+    </w:tbl>
+    <w:p>
+      <w:pPr>
+        <w:spacing w:before="0" w:after="60"/>
+      </w:pPr>
+    </w:p>
+    <w:p>
+      <w:pPr>
+        <w:pStyle w:val="Heading2"/>
+        <w:spacing w:before="120" w:after="60"/>
+      </w:pPr>
+      <w:r>
+        <w:rPr>
+          <w:color w:val="000000"/>
+        </w:rPr>
+        <w:t>2.4. Сохранение чекпоинтов</w:t>
+      </w:r>
+    </w:p>
+    <w:p>
+      <w:pPr>
+        <w:spacing w:after="40"/>
+      </w:pPr>
+      <w:r>
+        <w:t>Было:</w:t>
+      </w:r>
+    </w:p>
+    <w:tbl>
+      <w:tblPr>
+        <w:tblW w:type="auto" w:w="0"/>
+        <w:jc w:val="center"/>
+        <w:tblLayout w:type="fixed"/>
+        <w:tblLook w:firstColumn="1" w:firstRow="1" w:lastColumn="0" w:lastRow="0" w:noHBand="0" w:noVBand="1" w:val="04A0"/>
+      </w:tblPr>
+      <w:tblGrid>
+        <w:gridCol w:w="9360"/>
+      </w:tblGrid>
+      <w:tr>
+        <w:tc>
+          <w:tcPr>
+            <w:tcW w:type="dxa" w:w="9360"/>
+            <w:shd w:fill="F8F8F8"/>
+            <w:tcBorders>
+              <w:top w:val="single" w:sz="4" w:space="0" w:color="CCCCCC"/>
+              <w:left w:val="single" w:sz="4" w:space="0" w:color="CCCCCC"/>
+              <w:bottom w:val="single" w:sz="4" w:space="0" w:color="CCCCCC"/>
+              <w:right w:val="single" w:sz="4" w:space="0" w:color="CCCCCC"/>
+            </w:tcBorders>
+            <w:tcMar>
+              <w:top w:w="90" w:type="dxa"/>
+              <w:bottom w:w="90" w:type="dxa"/>
+              <w:left w:w="160" w:type="dxa"/>
+              <w:right w:w="160" w:type="dxa"/>
+            </w:tcMar>
+          </w:tcPr>
+          <w:p>
+            <w:pPr>
+              <w:spacing w:before="40" w:after="40" w:line="276" w:lineRule="auto"/>
+            </w:pPr>
+            <w:r>
+              <w:rPr>
+                <w:rFonts w:ascii="Consolas" w:hAnsi="Consolas"/>
+                <w:color w:val="000000"/>
+                <w:sz w:val="19"/>
+              </w:rPr>
+              <w:t>torch.save(model, './best_road_model.pth')</w:t>
+            </w:r>
+          </w:p>
+        </w:tc>
+      </w:tr>
+    </w:tbl>
+    <w:p>
+      <w:pPr>
+        <w:spacing w:before="0" w:after="60"/>
+      </w:pPr>
+    </w:p>
+    <w:p>
+      <w:pPr>
+        <w:spacing w:after="40"/>
+      </w:pPr>
+      <w:r>
+        <w:t>Стало:</w:t>
+      </w:r>
+    </w:p>
+    <w:tbl>
+      <w:tblPr>
+        <w:tblW w:type="auto" w:w="0"/>
+        <w:jc w:val="center"/>
+        <w:tblLayout w:type="fixed"/>
+        <w:tblLook w:firstColumn="1" w:firstRow="1" w:lastColumn="0" w:lastRow="0" w:noHBand="0" w:noVBand="1" w:val="04A0"/>
+      </w:tblPr>
+      <w:tblGrid>
+        <w:gridCol w:w="9360"/>
+      </w:tblGrid>
+      <w:tr>
+        <w:tc>
+          <w:tcPr>
+            <w:tcW w:type="dxa" w:w="9360"/>
+            <w:shd w:fill="F8F8F8"/>
+            <w:tcBorders>
+              <w:top w:val="single" w:sz="4" w:space="0" w:color="CCCCCC"/>
+              <w:left w:val="single" w:sz="4" w:space="0" w:color="CCCCCC"/>
+              <w:bottom w:val="single" w:sz="4" w:space="0" w:color="CCCCCC"/>
+              <w:right w:val="single" w:sz="4" w:space="0" w:color="CCCCCC"/>
+            </w:tcBorders>
+            <w:tcMar>
+              <w:top w:w="90" w:type="dxa"/>
+              <w:bottom w:w="90" w:type="dxa"/>
+              <w:left w:w="160" w:type="dxa"/>
+              <w:right w:w="160" w:type="dxa"/>
+            </w:tcMar>
+          </w:tcPr>
+          <w:p>
+            <w:pPr>
+              <w:spacing w:before="40" w:after="40" w:line="276" w:lineRule="auto"/>
+            </w:pPr>
+            <w:r>
+              <w:rPr>
+                <w:rFonts w:ascii="Consolas" w:hAnsi="Consolas"/>
+                <w:color w:val="000000"/>
+                <w:sz w:val="19"/>
+              </w:rPr>
+              <w:t>checkpoint = {</w:t>
+            </w:r>
+            <w:r>
+              <w:br/>
+            </w:r>
+            <w:r>
+              <w:rPr>
+                <w:rFonts w:ascii="Consolas" w:hAnsi="Consolas"/>
+                <w:color w:val="000000"/>
+                <w:sz w:val="19"/>
+              </w:rPr>
+              <w:t xml:space="preserve">    'epoch': epoch,</w:t>
+            </w:r>
+            <w:r>
+              <w:br/>
+            </w:r>
+            <w:r>
+              <w:rPr>
+                <w:rFonts w:ascii="Consolas" w:hAnsi="Consolas"/>
+                <w:color w:val="000000"/>
+                <w:sz w:val="19"/>
+              </w:rPr>
+              <w:t xml:space="preserve">    'state_dict': model.state_dict(),</w:t>
+            </w:r>
+            <w:r>
+              <w:br/>
+            </w:r>
+            <w:r>
+              <w:rPr>
+                <w:rFonts w:ascii="Consolas" w:hAnsi="Consolas"/>
+                <w:color w:val="000000"/>
+                <w:sz w:val="19"/>
+              </w:rPr>
+              <w:t xml:space="preserve">    'best_iou': best_iou_score,</w:t>
+            </w:r>
+            <w:r>
+              <w:br/>
+            </w:r>
+            <w:r>
+              <w:rPr>
+                <w:rFonts w:ascii="Consolas" w:hAnsi="Consolas"/>
+                <w:color w:val="000000"/>
+                <w:sz w:val="19"/>
+              </w:rPr>
+              <w:t xml:space="preserve">    'model_config': {'encoder': cfg.model.encoder, 'decoder': cfg.model.decoder},</w:t>
+            </w:r>
+            <w:r>
+              <w:br/>
+            </w:r>
+            <w:r>
+              <w:rPr>
+                <w:rFonts w:ascii="Consolas" w:hAnsi="Consolas"/>
+                <w:color w:val="000000"/>
+                <w:sz w:val="19"/>
+              </w:rPr>
+              <w:t xml:space="preserve">    'task': cfg.task</w:t>
+            </w:r>
+            <w:r>
+              <w:br/>
+            </w:r>
+            <w:r>
+              <w:rPr>
+                <w:rFonts w:ascii="Consolas" w:hAnsi="Consolas"/>
+                <w:color w:val="000000"/>
+                <w:sz w:val="19"/>
+              </w:rPr>
+              <w:t>}</w:t>
+            </w:r>
+            <w:r>
+              <w:br/>
+            </w:r>
+            <w:r>
+              <w:rPr>
+                <w:rFonts w:ascii="Consolas" w:hAnsi="Consolas"/>
+                <w:color w:val="000000"/>
+                <w:sz w:val="19"/>
+              </w:rPr>
+              <w:t>torch.save(checkpoint, save_path)</w:t>
+            </w:r>
+          </w:p>
+        </w:tc>
+      </w:tr>
+    </w:tbl>
+    <w:p>
+      <w:pPr>
+        <w:spacing w:before="0" w:after="60"/>
+      </w:pPr>
+    </w:p>
+    <w:p>
+      <w:pPr>
+        <w:spacing w:before="80" w:after="120" w:line="276" w:lineRule="auto"/>
       </w:pPr>
       <w:r>
         <w:rPr>
           <w:b/>
+          <w:color w:val="000000"/>
         </w:rPr>
-        <w:t xml:space="preserve">Подготовка датасета: </w:t>
+        <w:t xml:space="preserve">Примечание: </w:t>
       </w:r>
       <w:r>
-        <w:t>Данные загружены и распакованы в папку notebooks/input/massachusetts-buildings-dataset.</w:t>
-      </w:r>
-    </w:p>
-    <w:p>
-      <w:pPr>
-        <w:pStyle w:val="ListNumber"/>
-      </w:pPr>
-      <w:r>
         <w:rPr>
-          <w:b/>
+          <w:color w:val="000000"/>
+          <w:sz w:val="21"/>
         </w:rPr>
-        <w:t xml:space="preserve">Настройка скрипта обучения: </w:t>
-      </w:r>
-      <w:r>
-        <w:t>В файле train.py количество эпох увеличено до 30, а также установлен параметр num_workers=0 для стабильной работы DataLoader в среде Windows.</w:t>
-      </w:r>
-    </w:p>
-    <w:p>
-      <w:pPr>
-        <w:pStyle w:val="ListNumber"/>
-      </w:pPr>
-      <w:r>
-        <w:rPr>
-          <w:b/>
-        </w:rPr>
-        <w:t xml:space="preserve">Обучение: </w:t>
-      </w:r>
-      <w:r>
-        <w:t>Модель обучалась исключительно на центральном процессоре (CPU). Благодаря оптимизациям и относительно небольшому размеру данных, процесс занял около 1 часа 15 минут.</w:t>
-      </w:r>
-    </w:p>
-    <w:p>
-      <w:pPr>
-        <w:pStyle w:val="ListNumber"/>
-      </w:pPr>
-      <w:r>
-        <w:rPr>
-          <w:b/>
-        </w:rPr>
-        <w:t xml:space="preserve">Оценка и визуализация: </w:t>
-      </w:r>
-      <w:r>
-        <w:t>Достигнут высокий показатель Validation IoU (0.8505). Сгенерированы графики iou_score_plot.png и dice_loss_plot.png. Создана визуальная демонстрация предсказаний на тестовом снимке с помощью скрипта trained_demo.py.</w:t>
-      </w:r>
-    </w:p>
-    <w:p>
-      <w:pPr>
-        <w:pStyle w:val="IntenseQuote"/>
-      </w:pPr>
-      <w:r>
-        <w:t>Примечание: Модель зданий показала отличную сходимость уже на 20-й эпохе, но продолжение до 30 эпох позволило зафиксировать стабильно низкий уровень функции потерь.</w:t>
-      </w:r>
-    </w:p>
-    <w:p>
-      <w:pPr>
-        <w:pStyle w:val="Heading1"/>
-      </w:pPr>
-      <w:r>
-        <w:t>Часть 2: Сегментация дорог (Massachusetts Roads Dataset)</w:t>
-      </w:r>
-    </w:p>
-    <w:p>
-      <w:r>
-        <w:t>Во второй части мы масштабировали наше решение на гораздо более объемный и сложный датасет (около 6 ГБ).</w:t>
+        <w:t>Загрузчик весов в inference.py и evaluate.py поддерживает как новые state_dict, так и старые pickle-файлы.</w:t>
       </w:r>
     </w:p>
     <w:p>
       <w:pPr>
         <w:pStyle w:val="Heading2"/>
+        <w:spacing w:before="120" w:after="60"/>
       </w:pPr>
       <w:r>
-        <w:t>Выполненные шаги:</w:t>
+        <w:rPr>
+          <w:color w:val="000000"/>
+        </w:rPr>
+        <w:t>2.5. Мониторинг и ранняя остановка</w:t>
       </w:r>
     </w:p>
     <w:p>
       <w:pPr>
-        <w:pStyle w:val="ListNumber"/>
+        <w:spacing w:after="40"/>
       </w:pPr>
       <w:r>
-        <w:rPr>
-          <w:b/>
-        </w:rPr>
-        <w:t xml:space="preserve">Скачивание данных: </w:t>
-      </w:r>
-      <w:r>
-        <w:t>Через Kaggle CLI скачан массивный датасет дорог. Возникшая проблема со структурой папок (архив распаковался напрямую в notebooks/input) была оперативно исправлена с помощью скриптов PowerShell.</w:t>
-      </w:r>
-    </w:p>
-    <w:p>
-      <w:pPr>
-        <w:pStyle w:val="ListNumber"/>
-      </w:pPr>
-      <w:r>
-        <w:rPr>
-          <w:b/>
-        </w:rPr>
-        <w:t xml:space="preserve">Адаптация кода: </w:t>
-      </w:r>
-      <w:r>
-        <w:t>Создан отдельный скрипт train_road.py. В нем классы изменены на ['background', 'road'], а пути сохранения весов и графиков обновлены (best_road_model.pth, road_iou_score_plot.png и т.д.).</w:t>
-      </w:r>
-    </w:p>
-    <w:p>
-      <w:pPr>
-        <w:pStyle w:val="ListNumber"/>
-      </w:pPr>
-      <w:r>
-        <w:rPr>
-          <w:b/>
-        </w:rPr>
-        <w:t xml:space="preserve">Ресурсоемкое обучение: </w:t>
-      </w:r>
-      <w:r>
-        <w:t>Запущен процесс обучения на 30 эпох. Из-за гигантского объема данных (6 ГБ) и использования CPU обучение стало настоящим испытанием и продлилось почти 9 часов (с 16:50 до 01:46 следующего дня). Система успешно выдержала нагрузку без переполнения памяти, методично улучшая показатели качества.</w:t>
-      </w:r>
-    </w:p>
-    <w:p>
-      <w:pPr>
-        <w:pStyle w:val="ListNumber"/>
-      </w:pPr>
-      <w:r>
-        <w:rPr>
-          <w:b/>
-        </w:rPr>
-        <w:t xml:space="preserve">Оценка и визуализация: </w:t>
-      </w:r>
-      <w:r>
-        <w:t>Достигнут высокий показатель Validation IoU (0.8968). Создан и запущен скрипт trained_demo_road.py для генерации графической демонстрации предсказаний дорожной сети.</w:t>
-      </w:r>
-    </w:p>
-    <w:p>
-      <w:pPr>
-        <w:pStyle w:val="IntenseQuote"/>
-      </w:pPr>
-      <w:r>
-        <w:t>Важно: Обучение на процессоре таких тяжелых моделей занимает много времени. Использование графического ускорителя (GPU) позволило бы сократить этот процесс в разы.</w:t>
-      </w:r>
-    </w:p>
-    <w:p>
-      <w:pPr>
-        <w:pStyle w:val="Heading1"/>
-      </w:pPr>
-      <w:r>
-        <w:t>Обновление документации</w:t>
-      </w:r>
-    </w:p>
-    <w:p>
-      <w:r>
-        <w:t>В рамках завершения задачи были обновлены ключевые документы проекта:</w:t>
+        <w:t>В train.py добавлены:</w:t>
       </w:r>
     </w:p>
     <w:p>
@@ -204,7 +1083,17 @@
         <w:pStyle w:val="ListBullet"/>
       </w:pPr>
       <w:r>
-        <w:t>1. README.md дополнен новыми секциями с результатами 30 эпох для обоих датасетов, графиками и описанием железа (CPU) и времени.</w:t>
+        <w:rPr>
+          <w:b/>
+          <w:color w:val="000000"/>
+        </w:rPr>
+        <w:t xml:space="preserve">TensorBoard: </w:t>
+      </w:r>
+      <w:r>
+        <w:rPr>
+          <w:color w:val="000000"/>
+        </w:rPr>
+        <w:t>запись потерь и IoU (runs/road, runs/building).</w:t>
       </w:r>
     </w:p>
     <w:p>
@@ -212,7 +1101,17 @@
         <w:pStyle w:val="ListBullet"/>
       </w:pPr>
       <w:r>
-        <w:t>2. Основной Отчет.docx перегенерирован с подробным описанием и всеми графиками.</w:t>
+        <w:rPr>
+          <w:b/>
+          <w:color w:val="000000"/>
+        </w:rPr>
+        <w:t xml:space="preserve">Early Stopping: </w:t>
+      </w:r>
+      <w:r>
+        <w:rPr>
+          <w:color w:val="000000"/>
+        </w:rPr>
+        <w:t>остановка обучения при отсутствии роста валидационного IoU (--patience).</w:t>
       </w:r>
     </w:p>
     <w:p>
@@ -220,17 +1119,1103 @@
         <w:pStyle w:val="ListBullet"/>
       </w:pPr>
       <w:r>
-        <w:t>3. Все задачи в внутреннем трекере (task.md) успешно выполнены и закрыты.</w:t>
+        <w:rPr>
+          <w:b/>
+          <w:color w:val="000000"/>
+        </w:rPr>
+        <w:t xml:space="preserve">tqdm: </w:t>
+      </w:r>
+      <w:r>
+        <w:rPr>
+          <w:color w:val="000000"/>
+        </w:rPr>
+        <w:t>вывод текущего loss на каждом батче.</w:t>
       </w:r>
     </w:p>
+    <w:p>
+      <w:pPr>
+        <w:pStyle w:val="Heading2"/>
+        <w:spacing w:before="120" w:after="60"/>
+      </w:pPr>
+      <w:r>
+        <w:rPr>
+          <w:color w:val="000000"/>
+        </w:rPr>
+        <w:t>2.6. Test-Time Augmentation (TTA)</w:t>
+      </w:r>
+    </w:p>
+    <w:p>
+      <w:pPr>
+        <w:spacing w:after="40"/>
+      </w:pPr>
+      <w:r>
+        <w:t>Усреднение предсказаний исходного кадра, горизонтального и вертикального отражений:</w:t>
+      </w:r>
+    </w:p>
+    <w:tbl>
+      <w:tblPr>
+        <w:tblW w:type="auto" w:w="0"/>
+        <w:jc w:val="center"/>
+        <w:tblLayout w:type="fixed"/>
+        <w:tblLook w:firstColumn="1" w:firstRow="1" w:lastColumn="0" w:lastRow="0" w:noHBand="0" w:noVBand="1" w:val="04A0"/>
+      </w:tblPr>
+      <w:tblGrid>
+        <w:gridCol w:w="9360"/>
+      </w:tblGrid>
+      <w:tr>
+        <w:tc>
+          <w:tcPr>
+            <w:tcW w:type="dxa" w:w="9360"/>
+            <w:shd w:fill="F8F8F8"/>
+            <w:tcBorders>
+              <w:top w:val="single" w:sz="4" w:space="0" w:color="CCCCCC"/>
+              <w:left w:val="single" w:sz="4" w:space="0" w:color="CCCCCC"/>
+              <w:bottom w:val="single" w:sz="4" w:space="0" w:color="CCCCCC"/>
+              <w:right w:val="single" w:sz="4" w:space="0" w:color="CCCCCC"/>
+            </w:tcBorders>
+            <w:tcMar>
+              <w:top w:w="90" w:type="dxa"/>
+              <w:bottom w:w="90" w:type="dxa"/>
+              <w:left w:w="160" w:type="dxa"/>
+              <w:right w:w="160" w:type="dxa"/>
+            </w:tcMar>
+          </w:tcPr>
+          <w:p>
+            <w:pPr>
+              <w:spacing w:before="40" w:after="40" w:line="276" w:lineRule="auto"/>
+            </w:pPr>
+            <w:r>
+              <w:rPr>
+                <w:rFonts w:ascii="Consolas" w:hAnsi="Consolas"/>
+                <w:color w:val="000000"/>
+                <w:sz w:val="19"/>
+              </w:rPr>
+              <w:t>python inference.py --task road --tta --num-examples 8</w:t>
+            </w:r>
+          </w:p>
+        </w:tc>
+      </w:tr>
+    </w:tbl>
+    <w:p>
+      <w:pPr>
+        <w:spacing w:before="0" w:after="60"/>
+      </w:pPr>
+    </w:p>
+    <w:p>
+      <w:pPr>
+        <w:spacing w:before="160" w:after="200"/>
+        <w:pBdr>
+          <w:bottom w:val="single" w:sz="4" w:space="1" w:color="CCCCCC"/>
+        </w:pBdr>
+      </w:pPr>
+    </w:p>
+    <w:p>
+      <w:pPr>
+        <w:pStyle w:val="Heading1"/>
+        <w:spacing w:before="200" w:after="80"/>
+      </w:pPr>
+      <w:r>
+        <w:rPr>
+          <w:color w:val="000000"/>
+        </w:rPr>
+        <w:t>3. Результаты тестирования</w:t>
+      </w:r>
+    </w:p>
+    <w:p>
+      <w:pPr>
+        <w:pStyle w:val="Heading2"/>
+        <w:spacing w:before="120" w:after="60"/>
+      </w:pPr>
+      <w:r>
+        <w:rPr>
+          <w:color w:val="000000"/>
+        </w:rPr>
+        <w:t>3.1. Сводная таблица метрик на тестовом наборе</w:t>
+      </w:r>
+    </w:p>
+    <w:tbl>
+      <w:tblPr>
+        <w:tblW w:type="auto" w:w="0"/>
+        <w:jc w:val="center"/>
+        <w:tblLayout w:type="fixed"/>
+        <w:tblLook w:firstColumn="1" w:firstRow="1" w:lastColumn="0" w:lastRow="0" w:noHBand="0" w:noVBand="1" w:val="04A0"/>
+      </w:tblPr>
+      <w:tblGrid>
+        <w:gridCol w:w="3120"/>
+        <w:gridCol w:w="3120"/>
+        <w:gridCol w:w="3120"/>
+      </w:tblGrid>
+      <w:tr>
+        <w:tc>
+          <w:tcPr>
+            <w:tcW w:type="dxa" w:w="3600"/>
+            <w:shd w:fill="F0F0F0"/>
+            <w:tcBorders>
+              <w:top w:val="single" w:sz="4" w:space="0" w:color="CCCCCC"/>
+              <w:left w:val="single" w:sz="4" w:space="0" w:color="CCCCCC"/>
+              <w:bottom w:val="single" w:sz="4" w:space="0" w:color="CCCCCC"/>
+              <w:right w:val="single" w:sz="4" w:space="0" w:color="CCCCCC"/>
+            </w:tcBorders>
+            <w:tcMar>
+              <w:top w:w="70" w:type="dxa"/>
+              <w:bottom w:w="70" w:type="dxa"/>
+              <w:left w:w="120" w:type="dxa"/>
+              <w:right w:w="120" w:type="dxa"/>
+            </w:tcMar>
+          </w:tcPr>
+          <w:p>
+            <w:pPr>
+              <w:spacing w:before="60" w:after="60"/>
+            </w:pPr>
+            <w:r>
+              <w:rPr>
+                <w:b/>
+                <w:color w:val="000000"/>
+                <w:sz w:val="20"/>
+              </w:rPr>
+              <w:t>Метрика</w:t>
+            </w:r>
+          </w:p>
+        </w:tc>
+        <w:tc>
+          <w:tcPr>
+            <w:tcW w:type="dxa" w:w="2880"/>
+            <w:shd w:fill="F0F0F0"/>
+            <w:tcBorders>
+              <w:top w:val="single" w:sz="4" w:space="0" w:color="CCCCCC"/>
+              <w:left w:val="single" w:sz="4" w:space="0" w:color="CCCCCC"/>
+              <w:bottom w:val="single" w:sz="4" w:space="0" w:color="CCCCCC"/>
+              <w:right w:val="single" w:sz="4" w:space="0" w:color="CCCCCC"/>
+            </w:tcBorders>
+            <w:tcMar>
+              <w:top w:w="70" w:type="dxa"/>
+              <w:bottom w:w="70" w:type="dxa"/>
+              <w:left w:w="120" w:type="dxa"/>
+              <w:right w:w="120" w:type="dxa"/>
+            </w:tcMar>
+          </w:tcPr>
+          <w:p>
+            <w:pPr>
+              <w:spacing w:before="60" w:after="60"/>
+            </w:pPr>
+            <w:r>
+              <w:rPr>
+                <w:b/>
+                <w:color w:val="000000"/>
+                <w:sz w:val="20"/>
+              </w:rPr>
+              <w:t>Сегментация дорог (Road, 49 снимков)</w:t>
+            </w:r>
+          </w:p>
+        </w:tc>
+        <w:tc>
+          <w:tcPr>
+            <w:tcW w:type="dxa" w:w="2880"/>
+            <w:shd w:fill="F0F0F0"/>
+            <w:tcBorders>
+              <w:top w:val="single" w:sz="4" w:space="0" w:color="CCCCCC"/>
+              <w:left w:val="single" w:sz="4" w:space="0" w:color="CCCCCC"/>
+              <w:bottom w:val="single" w:sz="4" w:space="0" w:color="CCCCCC"/>
+              <w:right w:val="single" w:sz="4" w:space="0" w:color="CCCCCC"/>
+            </w:tcBorders>
+            <w:tcMar>
+              <w:top w:w="70" w:type="dxa"/>
+              <w:bottom w:w="70" w:type="dxa"/>
+              <w:left w:w="120" w:type="dxa"/>
+              <w:right w:w="120" w:type="dxa"/>
+            </w:tcMar>
+          </w:tcPr>
+          <w:p>
+            <w:pPr>
+              <w:spacing w:before="60" w:after="60"/>
+            </w:pPr>
+            <w:r>
+              <w:rPr>
+                <w:b/>
+                <w:color w:val="000000"/>
+                <w:sz w:val="20"/>
+              </w:rPr>
+              <w:t>Сегментация зданий (Building, 10 снимков)</w:t>
+            </w:r>
+          </w:p>
+        </w:tc>
+      </w:tr>
+      <w:tr>
+        <w:tc>
+          <w:tcPr>
+            <w:tcW w:type="dxa" w:w="3600"/>
+            <w:tcBorders>
+              <w:top w:val="single" w:sz="4" w:space="0" w:color="CCCCCC"/>
+              <w:left w:val="single" w:sz="4" w:space="0" w:color="CCCCCC"/>
+              <w:bottom w:val="single" w:sz="4" w:space="0" w:color="CCCCCC"/>
+              <w:right w:val="single" w:sz="4" w:space="0" w:color="CCCCCC"/>
+            </w:tcBorders>
+            <w:tcMar>
+              <w:top w:w="70" w:type="dxa"/>
+              <w:bottom w:w="70" w:type="dxa"/>
+              <w:left w:w="120" w:type="dxa"/>
+              <w:right w:w="120" w:type="dxa"/>
+            </w:tcMar>
+          </w:tcPr>
+          <w:p>
+            <w:pPr>
+              <w:spacing w:before="60" w:after="60"/>
+            </w:pPr>
+            <w:r>
+              <w:rPr>
+                <w:b/>
+                <w:color w:val="000000"/>
+                <w:sz w:val="20"/>
+              </w:rPr>
+              <w:t>IoU (Intersection over Union)</w:t>
+            </w:r>
+          </w:p>
+        </w:tc>
+        <w:tc>
+          <w:tcPr>
+            <w:tcW w:type="dxa" w:w="2880"/>
+            <w:tcBorders>
+              <w:top w:val="single" w:sz="4" w:space="0" w:color="CCCCCC"/>
+              <w:left w:val="single" w:sz="4" w:space="0" w:color="CCCCCC"/>
+              <w:bottom w:val="single" w:sz="4" w:space="0" w:color="CCCCCC"/>
+              <w:right w:val="single" w:sz="4" w:space="0" w:color="CCCCCC"/>
+            </w:tcBorders>
+            <w:tcMar>
+              <w:top w:w="70" w:type="dxa"/>
+              <w:bottom w:w="70" w:type="dxa"/>
+              <w:left w:w="120" w:type="dxa"/>
+              <w:right w:w="120" w:type="dxa"/>
+            </w:tcMar>
+          </w:tcPr>
+          <w:p>
+            <w:pPr>
+              <w:spacing w:before="60" w:after="60"/>
+            </w:pPr>
+            <w:r>
+              <w:rPr>
+                <w:color w:val="000000"/>
+                <w:sz w:val="20"/>
+              </w:rPr>
+              <w:t>0.4872 ± 0.0603</w:t>
+            </w:r>
+          </w:p>
+        </w:tc>
+        <w:tc>
+          <w:tcPr>
+            <w:tcW w:type="dxa" w:w="2880"/>
+            <w:tcBorders>
+              <w:top w:val="single" w:sz="4" w:space="0" w:color="CCCCCC"/>
+              <w:left w:val="single" w:sz="4" w:space="0" w:color="CCCCCC"/>
+              <w:bottom w:val="single" w:sz="4" w:space="0" w:color="CCCCCC"/>
+              <w:right w:val="single" w:sz="4" w:space="0" w:color="CCCCCC"/>
+            </w:tcBorders>
+            <w:tcMar>
+              <w:top w:w="70" w:type="dxa"/>
+              <w:bottom w:w="70" w:type="dxa"/>
+              <w:left w:w="120" w:type="dxa"/>
+              <w:right w:w="120" w:type="dxa"/>
+            </w:tcMar>
+          </w:tcPr>
+          <w:p>
+            <w:pPr>
+              <w:spacing w:before="60" w:after="60"/>
+            </w:pPr>
+            <w:r>
+              <w:rPr>
+                <w:color w:val="000000"/>
+                <w:sz w:val="20"/>
+              </w:rPr>
+              <w:t>0.6039 ± 0.0351</w:t>
+            </w:r>
+          </w:p>
+        </w:tc>
+      </w:tr>
+      <w:tr>
+        <w:tc>
+          <w:tcPr>
+            <w:tcW w:type="dxa" w:w="3600"/>
+            <w:tcBorders>
+              <w:top w:val="single" w:sz="4" w:space="0" w:color="CCCCCC"/>
+              <w:left w:val="single" w:sz="4" w:space="0" w:color="CCCCCC"/>
+              <w:bottom w:val="single" w:sz="4" w:space="0" w:color="CCCCCC"/>
+              <w:right w:val="single" w:sz="4" w:space="0" w:color="CCCCCC"/>
+            </w:tcBorders>
+            <w:tcMar>
+              <w:top w:w="70" w:type="dxa"/>
+              <w:bottom w:w="70" w:type="dxa"/>
+              <w:left w:w="120" w:type="dxa"/>
+              <w:right w:w="120" w:type="dxa"/>
+            </w:tcMar>
+          </w:tcPr>
+          <w:p>
+            <w:pPr>
+              <w:spacing w:before="60" w:after="60"/>
+            </w:pPr>
+            <w:r>
+              <w:rPr>
+                <w:b/>
+                <w:color w:val="000000"/>
+                <w:sz w:val="20"/>
+              </w:rPr>
+              <w:t>Dice / F1-Score</w:t>
+            </w:r>
+          </w:p>
+        </w:tc>
+        <w:tc>
+          <w:tcPr>
+            <w:tcW w:type="dxa" w:w="2880"/>
+            <w:tcBorders>
+              <w:top w:val="single" w:sz="4" w:space="0" w:color="CCCCCC"/>
+              <w:left w:val="single" w:sz="4" w:space="0" w:color="CCCCCC"/>
+              <w:bottom w:val="single" w:sz="4" w:space="0" w:color="CCCCCC"/>
+              <w:right w:val="single" w:sz="4" w:space="0" w:color="CCCCCC"/>
+            </w:tcBorders>
+            <w:tcMar>
+              <w:top w:w="70" w:type="dxa"/>
+              <w:bottom w:w="70" w:type="dxa"/>
+              <w:left w:w="120" w:type="dxa"/>
+              <w:right w:w="120" w:type="dxa"/>
+            </w:tcMar>
+          </w:tcPr>
+          <w:p>
+            <w:pPr>
+              <w:spacing w:before="60" w:after="60"/>
+            </w:pPr>
+            <w:r>
+              <w:rPr>
+                <w:color w:val="000000"/>
+                <w:sz w:val="20"/>
+              </w:rPr>
+              <w:t>0.6528 ± 0.0582</w:t>
+            </w:r>
+          </w:p>
+        </w:tc>
+        <w:tc>
+          <w:tcPr>
+            <w:tcW w:type="dxa" w:w="2880"/>
+            <w:tcBorders>
+              <w:top w:val="single" w:sz="4" w:space="0" w:color="CCCCCC"/>
+              <w:left w:val="single" w:sz="4" w:space="0" w:color="CCCCCC"/>
+              <w:bottom w:val="single" w:sz="4" w:space="0" w:color="CCCCCC"/>
+              <w:right w:val="single" w:sz="4" w:space="0" w:color="CCCCCC"/>
+            </w:tcBorders>
+            <w:tcMar>
+              <w:top w:w="70" w:type="dxa"/>
+              <w:bottom w:w="70" w:type="dxa"/>
+              <w:left w:w="120" w:type="dxa"/>
+              <w:right w:w="120" w:type="dxa"/>
+            </w:tcMar>
+          </w:tcPr>
+          <w:p>
+            <w:pPr>
+              <w:spacing w:before="60" w:after="60"/>
+            </w:pPr>
+            <w:r>
+              <w:rPr>
+                <w:color w:val="000000"/>
+                <w:sz w:val="20"/>
+              </w:rPr>
+              <w:t>0.7524 ± 0.0273</w:t>
+            </w:r>
+          </w:p>
+        </w:tc>
+      </w:tr>
+      <w:tr>
+        <w:tc>
+          <w:tcPr>
+            <w:tcW w:type="dxa" w:w="3600"/>
+            <w:tcBorders>
+              <w:top w:val="single" w:sz="4" w:space="0" w:color="CCCCCC"/>
+              <w:left w:val="single" w:sz="4" w:space="0" w:color="CCCCCC"/>
+              <w:bottom w:val="single" w:sz="4" w:space="0" w:color="CCCCCC"/>
+              <w:right w:val="single" w:sz="4" w:space="0" w:color="CCCCCC"/>
+            </w:tcBorders>
+            <w:tcMar>
+              <w:top w:w="70" w:type="dxa"/>
+              <w:bottom w:w="70" w:type="dxa"/>
+              <w:left w:w="120" w:type="dxa"/>
+              <w:right w:w="120" w:type="dxa"/>
+            </w:tcMar>
+          </w:tcPr>
+          <w:p>
+            <w:pPr>
+              <w:spacing w:before="60" w:after="60"/>
+            </w:pPr>
+            <w:r>
+              <w:rPr>
+                <w:b/>
+                <w:color w:val="000000"/>
+                <w:sz w:val="20"/>
+              </w:rPr>
+              <w:t>Precision</w:t>
+            </w:r>
+          </w:p>
+        </w:tc>
+        <w:tc>
+          <w:tcPr>
+            <w:tcW w:type="dxa" w:w="2880"/>
+            <w:tcBorders>
+              <w:top w:val="single" w:sz="4" w:space="0" w:color="CCCCCC"/>
+              <w:left w:val="single" w:sz="4" w:space="0" w:color="CCCCCC"/>
+              <w:bottom w:val="single" w:sz="4" w:space="0" w:color="CCCCCC"/>
+              <w:right w:val="single" w:sz="4" w:space="0" w:color="CCCCCC"/>
+            </w:tcBorders>
+            <w:tcMar>
+              <w:top w:w="70" w:type="dxa"/>
+              <w:bottom w:w="70" w:type="dxa"/>
+              <w:left w:w="120" w:type="dxa"/>
+              <w:right w:w="120" w:type="dxa"/>
+            </w:tcMar>
+          </w:tcPr>
+          <w:p>
+            <w:pPr>
+              <w:spacing w:before="60" w:after="60"/>
+            </w:pPr>
+            <w:r>
+              <w:rPr>
+                <w:color w:val="000000"/>
+                <w:sz w:val="20"/>
+              </w:rPr>
+              <w:t>0.5704 ± 0.0492</w:t>
+            </w:r>
+          </w:p>
+        </w:tc>
+        <w:tc>
+          <w:tcPr>
+            <w:tcW w:type="dxa" w:w="2880"/>
+            <w:tcBorders>
+              <w:top w:val="single" w:sz="4" w:space="0" w:color="CCCCCC"/>
+              <w:left w:val="single" w:sz="4" w:space="0" w:color="CCCCCC"/>
+              <w:bottom w:val="single" w:sz="4" w:space="0" w:color="CCCCCC"/>
+              <w:right w:val="single" w:sz="4" w:space="0" w:color="CCCCCC"/>
+            </w:tcBorders>
+            <w:tcMar>
+              <w:top w:w="70" w:type="dxa"/>
+              <w:bottom w:w="70" w:type="dxa"/>
+              <w:left w:w="120" w:type="dxa"/>
+              <w:right w:w="120" w:type="dxa"/>
+            </w:tcMar>
+          </w:tcPr>
+          <w:p>
+            <w:pPr>
+              <w:spacing w:before="60" w:after="60"/>
+            </w:pPr>
+            <w:r>
+              <w:rPr>
+                <w:color w:val="000000"/>
+                <w:sz w:val="20"/>
+              </w:rPr>
+              <w:t>0.7908 ± 0.0268</w:t>
+            </w:r>
+          </w:p>
+        </w:tc>
+      </w:tr>
+      <w:tr>
+        <w:tc>
+          <w:tcPr>
+            <w:tcW w:type="dxa" w:w="3600"/>
+            <w:tcBorders>
+              <w:top w:val="single" w:sz="4" w:space="0" w:color="CCCCCC"/>
+              <w:left w:val="single" w:sz="4" w:space="0" w:color="CCCCCC"/>
+              <w:bottom w:val="single" w:sz="4" w:space="0" w:color="CCCCCC"/>
+              <w:right w:val="single" w:sz="4" w:space="0" w:color="CCCCCC"/>
+            </w:tcBorders>
+            <w:tcMar>
+              <w:top w:w="70" w:type="dxa"/>
+              <w:bottom w:w="70" w:type="dxa"/>
+              <w:left w:w="120" w:type="dxa"/>
+              <w:right w:w="120" w:type="dxa"/>
+            </w:tcMar>
+          </w:tcPr>
+          <w:p>
+            <w:pPr>
+              <w:spacing w:before="60" w:after="60"/>
+            </w:pPr>
+            <w:r>
+              <w:rPr>
+                <w:b/>
+                <w:color w:val="000000"/>
+                <w:sz w:val="20"/>
+              </w:rPr>
+              <w:t>Recall (полнота)</w:t>
+            </w:r>
+          </w:p>
+        </w:tc>
+        <w:tc>
+          <w:tcPr>
+            <w:tcW w:type="dxa" w:w="2880"/>
+            <w:tcBorders>
+              <w:top w:val="single" w:sz="4" w:space="0" w:color="CCCCCC"/>
+              <w:left w:val="single" w:sz="4" w:space="0" w:color="CCCCCC"/>
+              <w:bottom w:val="single" w:sz="4" w:space="0" w:color="CCCCCC"/>
+              <w:right w:val="single" w:sz="4" w:space="0" w:color="CCCCCC"/>
+            </w:tcBorders>
+            <w:tcMar>
+              <w:top w:w="70" w:type="dxa"/>
+              <w:bottom w:w="70" w:type="dxa"/>
+              <w:left w:w="120" w:type="dxa"/>
+              <w:right w:w="120" w:type="dxa"/>
+            </w:tcMar>
+          </w:tcPr>
+          <w:p>
+            <w:pPr>
+              <w:spacing w:before="60" w:after="60"/>
+            </w:pPr>
+            <w:r>
+              <w:rPr>
+                <w:color w:val="000000"/>
+                <w:sz w:val="20"/>
+              </w:rPr>
+              <w:t>0.7730 ± 0.0991</w:t>
+            </w:r>
+          </w:p>
+        </w:tc>
+        <w:tc>
+          <w:tcPr>
+            <w:tcW w:type="dxa" w:w="2880"/>
+            <w:tcBorders>
+              <w:top w:val="single" w:sz="4" w:space="0" w:color="CCCCCC"/>
+              <w:left w:val="single" w:sz="4" w:space="0" w:color="CCCCCC"/>
+              <w:bottom w:val="single" w:sz="4" w:space="0" w:color="CCCCCC"/>
+              <w:right w:val="single" w:sz="4" w:space="0" w:color="CCCCCC"/>
+            </w:tcBorders>
+            <w:tcMar>
+              <w:top w:w="70" w:type="dxa"/>
+              <w:bottom w:w="70" w:type="dxa"/>
+              <w:left w:w="120" w:type="dxa"/>
+              <w:right w:w="120" w:type="dxa"/>
+            </w:tcMar>
+          </w:tcPr>
+          <w:p>
+            <w:pPr>
+              <w:spacing w:before="60" w:after="60"/>
+            </w:pPr>
+            <w:r>
+              <w:rPr>
+                <w:color w:val="000000"/>
+                <w:sz w:val="20"/>
+              </w:rPr>
+              <w:t>0.7187 ± 0.0385</w:t>
+            </w:r>
+          </w:p>
+        </w:tc>
+      </w:tr>
+      <w:tr>
+        <w:tc>
+          <w:tcPr>
+            <w:tcW w:type="dxa" w:w="3600"/>
+            <w:tcBorders>
+              <w:top w:val="single" w:sz="4" w:space="0" w:color="CCCCCC"/>
+              <w:left w:val="single" w:sz="4" w:space="0" w:color="CCCCCC"/>
+              <w:bottom w:val="single" w:sz="4" w:space="0" w:color="CCCCCC"/>
+              <w:right w:val="single" w:sz="4" w:space="0" w:color="CCCCCC"/>
+            </w:tcBorders>
+            <w:tcMar>
+              <w:top w:w="70" w:type="dxa"/>
+              <w:bottom w:w="70" w:type="dxa"/>
+              <w:left w:w="120" w:type="dxa"/>
+              <w:right w:w="120" w:type="dxa"/>
+            </w:tcMar>
+          </w:tcPr>
+          <w:p>
+            <w:pPr>
+              <w:spacing w:before="60" w:after="60"/>
+            </w:pPr>
+            <w:r>
+              <w:rPr>
+                <w:b/>
+                <w:color w:val="000000"/>
+                <w:sz w:val="20"/>
+              </w:rPr>
+              <w:t>Accuracy (пиксельная)</w:t>
+            </w:r>
+          </w:p>
+        </w:tc>
+        <w:tc>
+          <w:tcPr>
+            <w:tcW w:type="dxa" w:w="2880"/>
+            <w:tcBorders>
+              <w:top w:val="single" w:sz="4" w:space="0" w:color="CCCCCC"/>
+              <w:left w:val="single" w:sz="4" w:space="0" w:color="CCCCCC"/>
+              <w:bottom w:val="single" w:sz="4" w:space="0" w:color="CCCCCC"/>
+              <w:right w:val="single" w:sz="4" w:space="0" w:color="CCCCCC"/>
+            </w:tcBorders>
+            <w:tcMar>
+              <w:top w:w="70" w:type="dxa"/>
+              <w:bottom w:w="70" w:type="dxa"/>
+              <w:left w:w="120" w:type="dxa"/>
+              <w:right w:w="120" w:type="dxa"/>
+            </w:tcMar>
+          </w:tcPr>
+          <w:p>
+            <w:pPr>
+              <w:spacing w:before="60" w:after="60"/>
+            </w:pPr>
+            <w:r>
+              <w:rPr>
+                <w:color w:val="000000"/>
+                <w:sz w:val="20"/>
+              </w:rPr>
+              <w:t>0.9626 ± 0.0209</w:t>
+            </w:r>
+          </w:p>
+        </w:tc>
+        <w:tc>
+          <w:tcPr>
+            <w:tcW w:type="dxa" w:w="2880"/>
+            <w:tcBorders>
+              <w:top w:val="single" w:sz="4" w:space="0" w:color="CCCCCC"/>
+              <w:left w:val="single" w:sz="4" w:space="0" w:color="CCCCCC"/>
+              <w:bottom w:val="single" w:sz="4" w:space="0" w:color="CCCCCC"/>
+              <w:right w:val="single" w:sz="4" w:space="0" w:color="CCCCCC"/>
+            </w:tcBorders>
+            <w:tcMar>
+              <w:top w:w="70" w:type="dxa"/>
+              <w:bottom w:w="70" w:type="dxa"/>
+              <w:left w:w="120" w:type="dxa"/>
+              <w:right w:w="120" w:type="dxa"/>
+            </w:tcMar>
+          </w:tcPr>
+          <w:p>
+            <w:pPr>
+              <w:spacing w:before="60" w:after="60"/>
+            </w:pPr>
+            <w:r>
+              <w:rPr>
+                <w:color w:val="000000"/>
+                <w:sz w:val="20"/>
+              </w:rPr>
+              <w:t>0.9143 ± 0.0340</w:t>
+            </w:r>
+          </w:p>
+        </w:tc>
+      </w:tr>
+    </w:tbl>
+    <w:p>
+      <w:pPr>
+        <w:spacing w:before="0" w:after="120"/>
+      </w:pPr>
+    </w:p>
+    <w:p>
+      <w:pPr>
+        <w:pStyle w:val="Heading2"/>
+        <w:spacing w:before="120" w:after="60"/>
+      </w:pPr>
+      <w:r>
+        <w:rPr>
+          <w:color w:val="000000"/>
+        </w:rPr>
+        <w:t>3.2. Примеры сегментации дорог и зданий</w:t>
+      </w:r>
+    </w:p>
+    <w:p>
+      <w:r>
+        <w:drawing>
+          <wp:inline xmlns:a="http://schemas.openxmlformats.org/drawingml/2006/main" xmlns:pic="http://schemas.openxmlformats.org/drawingml/2006/picture">
+            <wp:extent cx="5669280" cy="1800689"/>
+            <wp:docPr id="1" name="Picture 1"/>
+            <wp:cNvGraphicFramePr>
+              <a:graphicFrameLocks noChangeAspect="1"/>
+            </wp:cNvGraphicFramePr>
+            <a:graphic>
+              <a:graphicData uri="http://schemas.openxmlformats.org/drawingml/2006/picture">
+                <pic:pic>
+                  <pic:nvPicPr>
+                    <pic:cNvPr id="0" name="road_example_1.png"/>
+                    <pic:cNvPicPr/>
+                  </pic:nvPicPr>
+                  <pic:blipFill>
+                    <a:blip r:embed="rId9"/>
+                    <a:stretch>
+                      <a:fillRect/>
+                    </a:stretch>
+                  </pic:blipFill>
+                  <pic:spPr>
+                    <a:xfrm>
+                      <a:off x="0" y="0"/>
+                      <a:ext cx="5669280" cy="1800689"/>
+                    </a:xfrm>
+                    <a:prstGeom prst="rect"/>
+                  </pic:spPr>
+                </pic:pic>
+              </a:graphicData>
+            </a:graphic>
+          </wp:inline>
+        </w:drawing>
+      </w:r>
+    </w:p>
+    <w:p>
+      <w:pPr>
+        <w:jc w:val="center"/>
+      </w:pPr>
+      <w:r>
+        <w:rPr>
+          <w:color w:val="000000"/>
+          <w:sz w:val="19"/>
+        </w:rPr>
+        <w:t>Рис. 1: Сегментация дорог (Пример 1: Городская дорожная сеть)</w:t>
+      </w:r>
+    </w:p>
+    <w:p>
+      <w:r>
+        <w:drawing>
+          <wp:inline xmlns:a="http://schemas.openxmlformats.org/drawingml/2006/main" xmlns:pic="http://schemas.openxmlformats.org/drawingml/2006/picture">
+            <wp:extent cx="5669280" cy="1800689"/>
+            <wp:docPr id="2" name="Picture 2"/>
+            <wp:cNvGraphicFramePr>
+              <a:graphicFrameLocks noChangeAspect="1"/>
+            </wp:cNvGraphicFramePr>
+            <a:graphic>
+              <a:graphicData uri="http://schemas.openxmlformats.org/drawingml/2006/picture">
+                <pic:pic>
+                  <pic:nvPicPr>
+                    <pic:cNvPr id="0" name="road_example_2.png"/>
+                    <pic:cNvPicPr/>
+                  </pic:nvPicPr>
+                  <pic:blipFill>
+                    <a:blip r:embed="rId10"/>
+                    <a:stretch>
+                      <a:fillRect/>
+                    </a:stretch>
+                  </pic:blipFill>
+                  <pic:spPr>
+                    <a:xfrm>
+                      <a:off x="0" y="0"/>
+                      <a:ext cx="5669280" cy="1800689"/>
+                    </a:xfrm>
+                    <a:prstGeom prst="rect"/>
+                  </pic:spPr>
+                </pic:pic>
+              </a:graphicData>
+            </a:graphic>
+          </wp:inline>
+        </w:drawing>
+      </w:r>
+    </w:p>
+    <w:p>
+      <w:pPr>
+        <w:jc w:val="center"/>
+      </w:pPr>
+      <w:r>
+        <w:rPr>
+          <w:color w:val="000000"/>
+          <w:sz w:val="19"/>
+        </w:rPr>
+        <w:t>Рис. 2: Сегментация дорог (Пример 2: Магистрали и развязки)</w:t>
+      </w:r>
+    </w:p>
+    <w:p>
+      <w:r>
+        <w:drawing>
+          <wp:inline xmlns:a="http://schemas.openxmlformats.org/drawingml/2006/main" xmlns:pic="http://schemas.openxmlformats.org/drawingml/2006/picture">
+            <wp:extent cx="5669280" cy="2267712"/>
+            <wp:docPr id="3" name="Picture 3"/>
+            <wp:cNvGraphicFramePr>
+              <a:graphicFrameLocks noChangeAspect="1"/>
+            </wp:cNvGraphicFramePr>
+            <a:graphic>
+              <a:graphicData uri="http://schemas.openxmlformats.org/drawingml/2006/picture">
+                <pic:pic>
+                  <pic:nvPicPr>
+                    <pic:cNvPr id="0" name="building_example_1.png"/>
+                    <pic:cNvPicPr/>
+                  </pic:nvPicPr>
+                  <pic:blipFill>
+                    <a:blip r:embed="rId11"/>
+                    <a:stretch>
+                      <a:fillRect/>
+                    </a:stretch>
+                  </pic:blipFill>
+                  <pic:spPr>
+                    <a:xfrm>
+                      <a:off x="0" y="0"/>
+                      <a:ext cx="5669280" cy="2267712"/>
+                    </a:xfrm>
+                    <a:prstGeom prst="rect"/>
+                  </pic:spPr>
+                </pic:pic>
+              </a:graphicData>
+            </a:graphic>
+          </wp:inline>
+        </w:drawing>
+      </w:r>
+    </w:p>
+    <w:p>
+      <w:pPr>
+        <w:jc w:val="center"/>
+      </w:pPr>
+      <w:r>
+        <w:rPr>
+          <w:color w:val="000000"/>
+          <w:sz w:val="19"/>
+        </w:rPr>
+        <w:t>Рис. 3: Сегментация зданий (Демонстрационный пример малоэтажной застройки)</w:t>
+      </w:r>
+    </w:p>
+    <w:p>
+      <w:pPr>
+        <w:spacing w:before="160" w:after="200"/>
+        <w:pBdr>
+          <w:bottom w:val="single" w:sz="4" w:space="1" w:color="CCCCCC"/>
+        </w:pBdr>
+      </w:pPr>
+    </w:p>
+    <w:p>
+      <w:pPr>
+        <w:pStyle w:val="Heading1"/>
+        <w:spacing w:before="200" w:after="80"/>
+      </w:pPr>
+      <w:r>
+        <w:rPr>
+          <w:color w:val="000000"/>
+        </w:rPr>
+        <w:t>4. Команды запуска</w:t>
+      </w:r>
+    </w:p>
+    <w:p>
+      <w:pPr>
+        <w:pStyle w:val="Heading2"/>
+        <w:spacing w:before="120" w:after="60"/>
+      </w:pPr>
+      <w:r>
+        <w:rPr>
+          <w:color w:val="000000"/>
+        </w:rPr>
+        <w:t>4.1. Обучение</w:t>
+      </w:r>
+    </w:p>
+    <w:tbl>
+      <w:tblPr>
+        <w:tblW w:type="auto" w:w="0"/>
+        <w:jc w:val="center"/>
+        <w:tblLayout w:type="fixed"/>
+        <w:tblLook w:firstColumn="1" w:firstRow="1" w:lastColumn="0" w:lastRow="0" w:noHBand="0" w:noVBand="1" w:val="04A0"/>
+      </w:tblPr>
+      <w:tblGrid>
+        <w:gridCol w:w="9360"/>
+      </w:tblGrid>
+      <w:tr>
+        <w:tc>
+          <w:tcPr>
+            <w:tcW w:type="dxa" w:w="9360"/>
+            <w:shd w:fill="F8F8F8"/>
+            <w:tcBorders>
+              <w:top w:val="single" w:sz="4" w:space="0" w:color="CCCCCC"/>
+              <w:left w:val="single" w:sz="4" w:space="0" w:color="CCCCCC"/>
+              <w:bottom w:val="single" w:sz="4" w:space="0" w:color="CCCCCC"/>
+              <w:right w:val="single" w:sz="4" w:space="0" w:color="CCCCCC"/>
+            </w:tcBorders>
+            <w:tcMar>
+              <w:top w:w="90" w:type="dxa"/>
+              <w:bottom w:w="90" w:type="dxa"/>
+              <w:left w:w="160" w:type="dxa"/>
+              <w:right w:w="160" w:type="dxa"/>
+            </w:tcMar>
+          </w:tcPr>
+          <w:p>
+            <w:pPr>
+              <w:spacing w:before="40" w:after="40" w:line="276" w:lineRule="auto"/>
+            </w:pPr>
+            <w:r>
+              <w:rPr>
+                <w:rFonts w:ascii="Consolas" w:hAnsi="Consolas"/>
+                <w:color w:val="000000"/>
+                <w:sz w:val="19"/>
+              </w:rPr>
+              <w:t>python train.py --task road --epochs 40 --batch-size 4 --loss combo</w:t>
+            </w:r>
+            <w:r>
+              <w:br/>
+            </w:r>
+            <w:r>
+              <w:rPr>
+                <w:rFonts w:ascii="Consolas" w:hAnsi="Consolas"/>
+                <w:color w:val="000000"/>
+                <w:sz w:val="19"/>
+              </w:rPr>
+              <w:t>python train.py --task building --epochs 40 --batch-size 4 --loss combo</w:t>
+            </w:r>
+          </w:p>
+        </w:tc>
+      </w:tr>
+    </w:tbl>
+    <w:p>
+      <w:pPr>
+        <w:spacing w:before="0" w:after="60"/>
+      </w:pPr>
+    </w:p>
+    <w:p>
+      <w:pPr>
+        <w:pStyle w:val="Heading2"/>
+        <w:spacing w:before="120" w:after="60"/>
+      </w:pPr>
+      <w:r>
+        <w:rPr>
+          <w:color w:val="000000"/>
+        </w:rPr>
+        <w:t>4.2. Инференс</w:t>
+      </w:r>
+    </w:p>
+    <w:tbl>
+      <w:tblPr>
+        <w:tblW w:type="auto" w:w="0"/>
+        <w:jc w:val="center"/>
+        <w:tblLayout w:type="fixed"/>
+        <w:tblLook w:firstColumn="1" w:firstRow="1" w:lastColumn="0" w:lastRow="0" w:noHBand="0" w:noVBand="1" w:val="04A0"/>
+      </w:tblPr>
+      <w:tblGrid>
+        <w:gridCol w:w="9360"/>
+      </w:tblGrid>
+      <w:tr>
+        <w:tc>
+          <w:tcPr>
+            <w:tcW w:type="dxa" w:w="9360"/>
+            <w:shd w:fill="F8F8F8"/>
+            <w:tcBorders>
+              <w:top w:val="single" w:sz="4" w:space="0" w:color="CCCCCC"/>
+              <w:left w:val="single" w:sz="4" w:space="0" w:color="CCCCCC"/>
+              <w:bottom w:val="single" w:sz="4" w:space="0" w:color="CCCCCC"/>
+              <w:right w:val="single" w:sz="4" w:space="0" w:color="CCCCCC"/>
+            </w:tcBorders>
+            <w:tcMar>
+              <w:top w:w="90" w:type="dxa"/>
+              <w:bottom w:w="90" w:type="dxa"/>
+              <w:left w:w="160" w:type="dxa"/>
+              <w:right w:w="160" w:type="dxa"/>
+            </w:tcMar>
+          </w:tcPr>
+          <w:p>
+            <w:pPr>
+              <w:spacing w:before="40" w:after="40" w:line="276" w:lineRule="auto"/>
+            </w:pPr>
+            <w:r>
+              <w:rPr>
+                <w:rFonts w:ascii="Consolas" w:hAnsi="Consolas"/>
+                <w:color w:val="000000"/>
+                <w:sz w:val="19"/>
+              </w:rPr>
+              <w:t>python inference.py --task road --num-examples 8</w:t>
+            </w:r>
+            <w:r>
+              <w:br/>
+            </w:r>
+            <w:r>
+              <w:rPr>
+                <w:rFonts w:ascii="Consolas" w:hAnsi="Consolas"/>
+                <w:color w:val="000000"/>
+                <w:sz w:val="19"/>
+              </w:rPr>
+              <w:t>python inference.py --task road --tta --num-examples 8</w:t>
+            </w:r>
+          </w:p>
+        </w:tc>
+      </w:tr>
+    </w:tbl>
+    <w:p>
+      <w:pPr>
+        <w:spacing w:before="0" w:after="60"/>
+      </w:pPr>
+    </w:p>
+    <w:p>
+      <w:pPr>
+        <w:pStyle w:val="Heading2"/>
+        <w:spacing w:before="120" w:after="60"/>
+      </w:pPr>
+      <w:r>
+        <w:rPr>
+          <w:color w:val="000000"/>
+        </w:rPr>
+        <w:t>4.3. Оценка метрик</w:t>
+      </w:r>
+    </w:p>
+    <w:tbl>
+      <w:tblPr>
+        <w:tblW w:type="auto" w:w="0"/>
+        <w:jc w:val="center"/>
+        <w:tblLayout w:type="fixed"/>
+        <w:tblLook w:firstColumn="1" w:firstRow="1" w:lastColumn="0" w:lastRow="0" w:noHBand="0" w:noVBand="1" w:val="04A0"/>
+      </w:tblPr>
+      <w:tblGrid>
+        <w:gridCol w:w="9360"/>
+      </w:tblGrid>
+      <w:tr>
+        <w:tc>
+          <w:tcPr>
+            <w:tcW w:type="dxa" w:w="9360"/>
+            <w:shd w:fill="F8F8F8"/>
+            <w:tcBorders>
+              <w:top w:val="single" w:sz="4" w:space="0" w:color="CCCCCC"/>
+              <w:left w:val="single" w:sz="4" w:space="0" w:color="CCCCCC"/>
+              <w:bottom w:val="single" w:sz="4" w:space="0" w:color="CCCCCC"/>
+              <w:right w:val="single" w:sz="4" w:space="0" w:color="CCCCCC"/>
+            </w:tcBorders>
+            <w:tcMar>
+              <w:top w:w="90" w:type="dxa"/>
+              <w:bottom w:w="90" w:type="dxa"/>
+              <w:left w:w="160" w:type="dxa"/>
+              <w:right w:w="160" w:type="dxa"/>
+            </w:tcMar>
+          </w:tcPr>
+          <w:p>
+            <w:pPr>
+              <w:spacing w:before="40" w:after="40" w:line="276" w:lineRule="auto"/>
+            </w:pPr>
+            <w:r>
+              <w:rPr>
+                <w:rFonts w:ascii="Consolas" w:hAnsi="Consolas"/>
+                <w:color w:val="000000"/>
+                <w:sz w:val="19"/>
+              </w:rPr>
+              <w:t>python evaluate.py --task road</w:t>
+            </w:r>
+            <w:r>
+              <w:br/>
+            </w:r>
+            <w:r>
+              <w:rPr>
+                <w:rFonts w:ascii="Consolas" w:hAnsi="Consolas"/>
+                <w:color w:val="000000"/>
+                <w:sz w:val="19"/>
+              </w:rPr>
+              <w:t>python evaluate.py --task building</w:t>
+            </w:r>
+          </w:p>
+        </w:tc>
+      </w:tr>
+    </w:tbl>
+    <w:p>
+      <w:pPr>
+        <w:spacing w:before="0" w:after="60"/>
+      </w:pPr>
+    </w:p>
     <w:sectPr>
+      <w:footerReference w:type="default" r:id="rId12"/>
       <w:pgSz w:w="12240" w:h="15840"/>
-      <w:pgMar w:top="1440" w:right="1800" w:bottom="1440" w:left="1800" w:header="720" w:footer="720" w:gutter="0"/>
+      <w:pgMar w:top="1440" w:right="1440" w:bottom="1440" w:left="1440" w:header="720" w:footer="720" w:gutter="0"/>
       <w:cols w:space="720"/>
       <w:docGrid w:linePitch="360"/>
     </w:sectPr>
   </w:body>
 </w:document>
+</file>
+
+<file path=word/footer1.xml><?xml version="1.0" encoding="utf-8"?>
+<w:ftr xmlns:m="http://schemas.openxmlformats.org/officeDocument/2006/math" xmlns:mc="http://schemas.openxmlformats.org/markup-compatibility/2006" xmlns:mo="http://schemas.microsoft.com/office/mac/office/2008/main" xmlns:mv="urn:schemas-microsoft-com:mac:vml" xmlns:o="urn:schemas-microsoft-com:office:office" xmlns:r="http://schemas.openxmlformats.org/officeDocument/2006/relationships" xmlns:v="urn:schemas-microsoft-com:vml" xmlns:w10="urn:schemas-microsoft-com:office:word" xmlns:w14="http://schemas.microsoft.com/office/word/2010/wordml" xmlns:w="http://schemas.openxmlformats.org/wordprocessingml/2006/main" xmlns:wne="http://schemas.microsoft.com/office/word/2006/wordml" xmlns:wp14="http://schemas.microsoft.com/office/word/2010/wordprocessingDrawing" xmlns:wp="http://schemas.openxmlformats.org/drawingml/2006/wordprocessingDrawing" xmlns:wpc="http://schemas.microsoft.com/office/word/2010/wordprocessingCanvas" xmlns:wpg="http://schemas.microsoft.com/office/word/2010/wordprocessingGroup" xmlns:wpi="http://schemas.microsoft.com/office/word/2010/wordprocessingInk" xmlns:wps="http://schemas.microsoft.com/office/word/2010/wordprocessingShape" mc:Ignorable="w14 wp14">
+  <w:p>
+    <w:pPr>
+      <w:pStyle w:val="Footer"/>
+      <w:jc w:val="center"/>
+    </w:pPr>
+    <w:r>
+      <w:rPr>
+        <w:rFonts w:ascii="Calibri" w:hAnsi="Calibri"/>
+        <w:color w:val="000000"/>
+        <w:sz w:val="20"/>
+      </w:rPr>
+      <w:fldSimple w:instr="PAGE"/>
+    </w:r>
+  </w:p>
+</w:ftr>
 </file>
 
 <file path=word/numbering.xml><?xml version="1.0" encoding="utf-8"?>
@@ -596,6 +2581,11 @@
     <w:name w:val="Normal"/>
     <w:qFormat/>
     <w:rsid w:val="00FC693F"/>
+    <w:rPr>
+      <w:rFonts w:ascii="Calibri" w:hAnsi="Calibri"/>
+      <w:color w:val="000000"/>
+      <w:sz w:val="22"/>
+    </w:rPr>
   </w:style>
   <w:style w:type="paragraph" w:styleId="Header">
     <w:name w:val="header"/>

</xml_diff>